<commit_message>
Restructuring research roadmap, experiments config handling (json --> yaml) and scope of OOD analysis
</commit_message>
<xml_diff>
--- a/scripts/cluster_helper.docx
+++ b/scripts/cluster_helper.docx
@@ -468,6 +468,20 @@
     <w:p>
       <w:r>
         <w:lastRenderedPageBreak/>
+        <w:t xml:space="preserve">  </w:t>
+      </w:r>
+      <w:r>
+        <w:t xml:space="preserve"> </w:t>
+      </w:r>
+    </w:p>
+    <w:p/>
+    <w:p>
+      <w:r>
+        <w:t xml:space="preserve">  # Full run</w:t>
+      </w:r>
+    </w:p>
+    <w:p>
+      <w:r>
         <w:t xml:space="preserve">  python src/finetuning.py \</w:t>
       </w:r>
     </w:p>
@@ -489,7 +503,17 @@
       </w:r>
       <w:proofErr w:type="spellEnd"/>
       <w:r>
-        <w:t xml:space="preserve"> --mode fit \</w:t>
+        <w:t xml:space="preserve"> --mode </w:t>
+      </w:r>
+      <w:proofErr w:type="spellStart"/>
+      <w:proofErr w:type="gramStart"/>
+      <w:r>
+        <w:t>fit,optimization</w:t>
+      </w:r>
+      <w:proofErr w:type="spellEnd"/>
+      <w:proofErr w:type="gramEnd"/>
+      <w:r>
+        <w:t xml:space="preserve"> \</w:t>
       </w:r>
     </w:p>
     <w:p>
@@ -502,7 +526,7 @@
       </w:r>
       <w:proofErr w:type="spellEnd"/>
       <w:r>
-        <w:t xml:space="preserve"> --epochs 2 --</w:t>
+        <w:t xml:space="preserve"> --epochs 20 --</w:t>
       </w:r>
       <w:proofErr w:type="spellStart"/>
       <w:r>
@@ -510,111 +534,429 @@
       </w:r>
       <w:proofErr w:type="spellEnd"/>
       <w:r>
-        <w:t xml:space="preserve"> 2 --save</w:t>
+        <w:t xml:space="preserve"> 30 --budget 100 --save</w:t>
       </w:r>
     </w:p>
     <w:p/>
     <w:p>
       <w:r>
-        <w:t xml:space="preserve">  # Full run</w:t>
-      </w:r>
-    </w:p>
-    <w:p>
-      <w:r>
-        <w:t xml:space="preserve">  python src/finetuning.py \</w:t>
-      </w:r>
-    </w:p>
-    <w:p>
-      <w:r>
-        <w:t xml:space="preserve">      --dataset </w:t>
-      </w:r>
-      <w:proofErr w:type="spellStart"/>
-      <w:r>
-        <w:t>nhp</w:t>
-      </w:r>
-      <w:proofErr w:type="spellEnd"/>
-      <w:r>
-        <w:t xml:space="preserve"> --split </w:t>
-      </w:r>
-      <w:proofErr w:type="spellStart"/>
-      <w:r>
-        <w:t>inter_subject</w:t>
-      </w:r>
-      <w:proofErr w:type="spellEnd"/>
-      <w:r>
-        <w:t xml:space="preserve"> --mode </w:t>
-      </w:r>
-      <w:proofErr w:type="spellStart"/>
+        <w:t xml:space="preserve">  7. Pull results locally when done</w:t>
+      </w:r>
+    </w:p>
+    <w:p>
+      <w:r>
+        <w:t xml:space="preserve">  # From LOCAL machine:</w:t>
+      </w:r>
+    </w:p>
+    <w:p>
+      <w:r>
+        <w:t xml:space="preserve">  bash scripts/export_results.sh &lt;username&gt;</w:t>
+      </w:r>
+    </w:p>
+    <w:p/>
+    <w:p>
+      <w:r>
+        <w:t xml:space="preserve">  ---</w:t>
+      </w:r>
+    </w:p>
+    <w:p>
+      <w:r>
+        <w:t xml:space="preserve">  Monitoring</w:t>
+      </w:r>
+    </w:p>
+    <w:p/>
+    <w:p>
+      <w:r>
+        <w:t xml:space="preserve">  </w:t>
+      </w:r>
+      <w:proofErr w:type="spellStart"/>
+      <w:r>
+        <w:t>squeue</w:t>
+      </w:r>
+      <w:proofErr w:type="spellEnd"/>
+      <w:r>
+        <w:t xml:space="preserve"> -u $USER                      # check job status</w:t>
+      </w:r>
+    </w:p>
+    <w:p>
+      <w:r>
+        <w:t xml:space="preserve">  </w:t>
+      </w:r>
+      <w:proofErr w:type="spellStart"/>
+      <w:r>
+        <w:t>sinfo</w:t>
+      </w:r>
+      <w:proofErr w:type="spellEnd"/>
+      <w:r>
+        <w:t xml:space="preserve"> -Ogres:</w:t>
+      </w:r>
       <w:proofErr w:type="gramStart"/>
       <w:r>
-        <w:t>fit,optimization</w:t>
-      </w:r>
-      <w:proofErr w:type="spellEnd"/>
+        <w:t>27,nodelist</w:t>
+      </w:r>
       <w:proofErr w:type="gramEnd"/>
       <w:r>
-        <w:t xml:space="preserve"> \</w:t>
-      </w:r>
-    </w:p>
-    <w:p>
-      <w:r>
-        <w:t xml:space="preserve">      --device </w:t>
-      </w:r>
-      <w:proofErr w:type="spellStart"/>
-      <w:r>
-        <w:t>cuda</w:t>
-      </w:r>
-      <w:proofErr w:type="spellEnd"/>
-      <w:r>
-        <w:t xml:space="preserve"> --epochs 20 --</w:t>
-      </w:r>
-      <w:proofErr w:type="spellStart"/>
-      <w:r>
-        <w:t>n_reps</w:t>
-      </w:r>
-      <w:proofErr w:type="spellEnd"/>
-      <w:r>
-        <w:t xml:space="preserve"> 30 --budget 100 --save</w:t>
+        <w:t xml:space="preserve"> -</w:t>
+      </w:r>
+      <w:proofErr w:type="spellStart"/>
+      <w:proofErr w:type="gramStart"/>
+      <w:r>
+        <w:t>tidle,mix</w:t>
+      </w:r>
+      <w:proofErr w:type="spellEnd"/>
+      <w:proofErr w:type="gramEnd"/>
+      <w:r>
+        <w:t xml:space="preserve">  # see available GPUs</w:t>
+      </w:r>
+    </w:p>
+    <w:p>
+      <w:r>
+        <w:t xml:space="preserve">  </w:t>
+      </w:r>
+      <w:proofErr w:type="spellStart"/>
+      <w:r>
+        <w:t>savail</w:t>
+      </w:r>
+      <w:proofErr w:type="spellEnd"/>
+      <w:r>
+        <w:t xml:space="preserve">                               # custom Mila command for available GPUs</w:t>
       </w:r>
     </w:p>
     <w:p/>
     <w:p>
       <w:r>
-        <w:t xml:space="preserve">  7. Pull results locally when done</w:t>
-      </w:r>
-    </w:p>
-    <w:p>
-      <w:r>
-        <w:t xml:space="preserve">  # From LOCAL machine:</w:t>
-      </w:r>
-    </w:p>
-    <w:p>
-      <w:r>
-        <w:t xml:space="preserve">  bash scripts/export_results.sh &lt;username&gt;</w:t>
-      </w:r>
+        <w:t xml:space="preserve">  Tip: If the interactive session drops, re-attach with </w:t>
+      </w:r>
+      <w:proofErr w:type="spellStart"/>
+      <w:r>
+        <w:t>sattach</w:t>
+      </w:r>
+      <w:proofErr w:type="spellEnd"/>
+      <w:r>
+        <w:t xml:space="preserve"> --</w:t>
+      </w:r>
+      <w:proofErr w:type="spellStart"/>
+      <w:r>
+        <w:t>pty</w:t>
+      </w:r>
+      <w:proofErr w:type="spellEnd"/>
+      <w:r>
+        <w:t xml:space="preserve"> &lt;</w:t>
+      </w:r>
+      <w:proofErr w:type="spellStart"/>
+      <w:r>
+        <w:t>jobid</w:t>
+      </w:r>
+      <w:proofErr w:type="spellEnd"/>
+      <w:r>
+        <w:t>&gt;.0</w:t>
+      </w:r>
+    </w:p>
+    <w:p>
+      <w:pPr>
+        <w:pBdr>
+          <w:bottom w:val="single" w:sz="6" w:space="1" w:color="auto"/>
+        </w:pBdr>
+      </w:pPr>
     </w:p>
     <w:p/>
     <w:p>
+      <w:proofErr w:type="gramStart"/>
+      <w:r>
+        <w:t>what</w:t>
+      </w:r>
+      <w:proofErr w:type="gramEnd"/>
+      <w:r>
+        <w:t xml:space="preserve"> if I instead want to run </w:t>
+      </w:r>
+      <w:proofErr w:type="spellStart"/>
+      <w:r>
+        <w:t>VSCode</w:t>
+      </w:r>
+      <w:proofErr w:type="spellEnd"/>
+      <w:r>
+        <w:t xml:space="preserve"> on the cluster by using the Remote-SSH </w:t>
+      </w:r>
+      <w:proofErr w:type="spellStart"/>
+      <w:r>
+        <w:t>extention</w:t>
+      </w:r>
+      <w:proofErr w:type="spellEnd"/>
+      <w:r>
+        <w:t xml:space="preserve"> and selecting a </w:t>
+      </w:r>
+      <w:proofErr w:type="spellStart"/>
+      <w:r>
+        <w:t>mila</w:t>
+      </w:r>
+      <w:proofErr w:type="spellEnd"/>
+      <w:r>
+        <w:t xml:space="preserve"> code command to request </w:t>
+      </w:r>
+      <w:proofErr w:type="spellStart"/>
+      <w:r>
+        <w:t>ressources</w:t>
+      </w:r>
+      <w:proofErr w:type="spellEnd"/>
+      <w:r>
+        <w:t xml:space="preserve">. What's the </w:t>
+      </w:r>
+      <w:proofErr w:type="gramStart"/>
+      <w:r>
+        <w:t>different</w:t>
+      </w:r>
+      <w:proofErr w:type="gramEnd"/>
+      <w:r>
+        <w:t xml:space="preserve"> between both                procedures? Which one allows me to have </w:t>
+      </w:r>
+      <w:proofErr w:type="spellStart"/>
+      <w:r>
+        <w:t>vscode</w:t>
+      </w:r>
+      <w:proofErr w:type="spellEnd"/>
+      <w:r>
+        <w:t xml:space="preserve"> match the code that's hosted in the </w:t>
+      </w:r>
+      <w:proofErr w:type="spellStart"/>
+      <w:r>
+        <w:t>mila</w:t>
+      </w:r>
+      <w:proofErr w:type="spellEnd"/>
+      <w:r>
+        <w:t xml:space="preserve"> cluster?                                                                                            </w:t>
+      </w:r>
+    </w:p>
+    <w:p>
+      <w:r>
+        <w:t xml:space="preserve">                                                                                                                                                                                                </w:t>
+      </w:r>
+    </w:p>
+    <w:p>
+      <w:r>
+        <w:t xml:space="preserve">● Two approaches compared                                                                                                                                                                       </w:t>
+      </w:r>
+    </w:p>
+    <w:p>
+      <w:r>
+        <w:lastRenderedPageBreak/>
+        <w:t xml:space="preserve">                                                                                                                                                                                                </w:t>
+      </w:r>
+    </w:p>
+    <w:p>
+      <w:r>
+        <w:t xml:space="preserve">  Approach 1 — </w:t>
+      </w:r>
+      <w:proofErr w:type="spellStart"/>
+      <w:r>
+        <w:t>srun</w:t>
+      </w:r>
+      <w:proofErr w:type="spellEnd"/>
+      <w:r>
+        <w:t xml:space="preserve"> --preserve-env (terminal only)                                                                                                                                                                                                                                                                                                                                              </w:t>
+      </w:r>
+    </w:p>
+    <w:p>
+      <w:r>
+        <w:t xml:space="preserve">  Local machine          Mila login node          Compute node                                                                                                                                      </w:t>
+      </w:r>
+      <w:proofErr w:type="spellStart"/>
+      <w:r>
+        <w:t>VSCode</w:t>
+      </w:r>
+      <w:proofErr w:type="spellEnd"/>
+      <w:r>
+        <w:t xml:space="preserve"> (local) ──X──  ssh ──────────────────&gt;  </w:t>
+      </w:r>
+      <w:proofErr w:type="spellStart"/>
+      <w:r>
+        <w:t>srun</w:t>
+      </w:r>
+      <w:proofErr w:type="spellEnd"/>
+      <w:r>
+        <w:t xml:space="preserve"> shell                                                                                                                                       (edits local files)                             (runs cluster code)                                                                                                                           - Your editor is local, your code is on $SCRATCH → they are different copies                                                                                                                    - You must </w:t>
+      </w:r>
+      <w:proofErr w:type="spellStart"/>
+      <w:r>
+        <w:t>rsync</w:t>
+      </w:r>
+      <w:proofErr w:type="spellEnd"/>
+      <w:r>
+        <w:t xml:space="preserve">/git </w:t>
+      </w:r>
+      <w:proofErr w:type="spellStart"/>
+      <w:r>
+        <w:t>push+pull</w:t>
+      </w:r>
+      <w:proofErr w:type="spellEnd"/>
+      <w:r>
+        <w:t xml:space="preserve"> every time you change something                                                                                                                                  - Good for batch runs where you don't need to iterate                                                                                                                                                                                                                                                                                                                                           ---                                                                                                                                                                                             Approach 2 — </w:t>
+      </w:r>
+      <w:proofErr w:type="spellStart"/>
+      <w:r>
+        <w:t>mila</w:t>
+      </w:r>
+      <w:proofErr w:type="spellEnd"/>
+      <w:r>
+        <w:t xml:space="preserve"> code (</w:t>
+      </w:r>
+      <w:proofErr w:type="spellStart"/>
+      <w:r>
+        <w:t>VSCode</w:t>
+      </w:r>
+      <w:proofErr w:type="spellEnd"/>
+      <w:r>
+        <w:t xml:space="preserve"> Remote-SSH)                                                                                                                                                                                                                                                                                                                                                      Local machine          Mila login node          Compute node                                                                                                                                      </w:t>
+      </w:r>
+      <w:proofErr w:type="spellStart"/>
+      <w:r>
+        <w:t>VSCode</w:t>
+      </w:r>
+      <w:proofErr w:type="spellEnd"/>
+      <w:r>
+        <w:t xml:space="preserve"> ─────────────  SSH tunnel ────────────&gt; </w:t>
+      </w:r>
+      <w:proofErr w:type="spellStart"/>
+      <w:r>
+        <w:t>VSCode</w:t>
+      </w:r>
+      <w:proofErr w:type="spellEnd"/>
+      <w:r>
+        <w:t xml:space="preserve"> Server                                                                                                                                </w:t>
+      </w:r>
+    </w:p>
+    <w:p>
+      <w:r>
+        <w:t xml:space="preserve">    (UI only, </w:t>
+      </w:r>
+      <w:proofErr w:type="gramStart"/>
+      <w:r>
+        <w:t xml:space="preserve">local)   </w:t>
+      </w:r>
+      <w:proofErr w:type="gramEnd"/>
+      <w:r>
+        <w:t xml:space="preserve">                         </w:t>
+      </w:r>
+      <w:proofErr w:type="gramStart"/>
+      <w:r>
+        <w:t xml:space="preserve">   (</w:t>
+      </w:r>
+      <w:proofErr w:type="gramEnd"/>
+      <w:r>
+        <w:t>editor + terminal + files)</w:t>
+      </w:r>
+    </w:p>
+    <w:p>
+      <w:r>
+        <w:t xml:space="preserve">  - </w:t>
+      </w:r>
+      <w:proofErr w:type="spellStart"/>
+      <w:r>
+        <w:t>VSCode's</w:t>
+      </w:r>
+      <w:proofErr w:type="spellEnd"/>
+      <w:r>
+        <w:t xml:space="preserve"> file explorer, editor, and terminal all run on the compute node</w:t>
+      </w:r>
+    </w:p>
+    <w:p>
+      <w:r>
+        <w:t xml:space="preserve">  - You're directly editing $SCRATCH/projects/PFNs4Neurostim — no sync needed</w:t>
+      </w:r>
+    </w:p>
+    <w:p>
+      <w:r>
+        <w:t xml:space="preserve">  - The integrated terminal has GPU access (the SLURM allocation)</w:t>
+      </w:r>
+    </w:p>
+    <w:p>
+      <w:r>
+        <w:t xml:space="preserve">  - This is the one that keeps </w:t>
+      </w:r>
+      <w:proofErr w:type="spellStart"/>
+      <w:r>
+        <w:t>VSCode</w:t>
+      </w:r>
+      <w:proofErr w:type="spellEnd"/>
+      <w:r>
+        <w:t xml:space="preserve"> matched to the cluster code</w:t>
+      </w:r>
+    </w:p>
+    <w:p/>
+    <w:p>
       <w:r>
         <w:t xml:space="preserve">  ---</w:t>
       </w:r>
     </w:p>
     <w:p>
       <w:r>
-        <w:t xml:space="preserve">  Monitoring</w:t>
+        <w:t xml:space="preserve">  How to use </w:t>
+      </w:r>
+      <w:proofErr w:type="spellStart"/>
+      <w:r>
+        <w:t>mila</w:t>
+      </w:r>
+      <w:proofErr w:type="spellEnd"/>
+      <w:r>
+        <w:t xml:space="preserve"> code</w:t>
       </w:r>
     </w:p>
     <w:p/>
     <w:p>
       <w:r>
+        <w:t xml:space="preserve">  Install </w:t>
+      </w:r>
+      <w:proofErr w:type="spellStart"/>
+      <w:r>
+        <w:t>milatools</w:t>
+      </w:r>
+      <w:proofErr w:type="spellEnd"/>
+      <w:r>
+        <w:t xml:space="preserve"> on your local machine once:</w:t>
+      </w:r>
+    </w:p>
+    <w:p>
+      <w:r>
+        <w:t xml:space="preserve">  pip install </w:t>
+      </w:r>
+      <w:proofErr w:type="spellStart"/>
+      <w:r>
+        <w:t>milatools</w:t>
+      </w:r>
+      <w:proofErr w:type="spellEnd"/>
+    </w:p>
+    <w:p>
+      <w:r>
         <w:t xml:space="preserve">  </w:t>
       </w:r>
       <w:proofErr w:type="spellStart"/>
       <w:r>
-        <w:t>squeue</w:t>
-      </w:r>
-      <w:proofErr w:type="spellEnd"/>
-      <w:r>
-        <w:t xml:space="preserve"> -u $USER                      # check job status</w:t>
+        <w:t>mila</w:t>
+      </w:r>
+      <w:proofErr w:type="spellEnd"/>
+      <w:r>
+        <w:t xml:space="preserve"> </w:t>
+      </w:r>
+      <w:proofErr w:type="spellStart"/>
+      <w:r>
+        <w:t>init</w:t>
+      </w:r>
+      <w:proofErr w:type="spellEnd"/>
+      <w:r>
+        <w:t xml:space="preserve">   # one-time SSH config setup</w:t>
+      </w:r>
+    </w:p>
+    <w:p/>
+    <w:p>
+      <w:r>
+        <w:t xml:space="preserve">  Then to open a </w:t>
+      </w:r>
+      <w:proofErr w:type="spellStart"/>
+      <w:r>
+        <w:t>VSCode</w:t>
+      </w:r>
+      <w:proofErr w:type="spellEnd"/>
+      <w:r>
+        <w:t xml:space="preserve"> session with resources:</w:t>
       </w:r>
     </w:p>
     <w:p>
@@ -623,72 +965,140 @@
       </w:r>
       <w:proofErr w:type="spellStart"/>
       <w:r>
-        <w:t>sinfo</w:t>
-      </w:r>
-      <w:proofErr w:type="spellEnd"/>
-      <w:r>
-        <w:t xml:space="preserve"> -Ogres:</w:t>
+        <w:t>mila</w:t>
+      </w:r>
+      <w:proofErr w:type="spellEnd"/>
+      <w:r>
+        <w:t xml:space="preserve"> code $SCRATCH/projects/PFNs4Neurostim \</w:t>
+      </w:r>
+    </w:p>
+    <w:p>
+      <w:r>
+        <w:t xml:space="preserve">      --</w:t>
+      </w:r>
+      <w:proofErr w:type="spellStart"/>
+      <w:r>
+        <w:t>alloc</w:t>
+      </w:r>
+      <w:proofErr w:type="spellEnd"/>
+      <w:r>
+        <w:t xml:space="preserve"> --</w:t>
+      </w:r>
+      <w:proofErr w:type="spellStart"/>
+      <w:r>
+        <w:t>gres</w:t>
+      </w:r>
+      <w:proofErr w:type="spellEnd"/>
+      <w:r>
+        <w:t>=gpu:1 -c 4 --mem=32G -t 2:00:00 --partition=main</w:t>
+      </w:r>
+    </w:p>
+    <w:p/>
+    <w:p>
+      <w:r>
+        <w:lastRenderedPageBreak/>
+        <w:t xml:space="preserve">  This allocates a SLURM job, starts a </w:t>
+      </w:r>
+      <w:proofErr w:type="spellStart"/>
+      <w:r>
+        <w:t>VSCode</w:t>
+      </w:r>
+      <w:proofErr w:type="spellEnd"/>
+      <w:r>
+        <w:t xml:space="preserve"> Server on the </w:t>
       </w:r>
       <w:proofErr w:type="gramStart"/>
       <w:r>
-        <w:t>27,nodelist</w:t>
+        <w:t>compute</w:t>
       </w:r>
       <w:proofErr w:type="gramEnd"/>
       <w:r>
-        <w:t xml:space="preserve"> -</w:t>
-      </w:r>
-      <w:proofErr w:type="spellStart"/>
-      <w:proofErr w:type="gramStart"/>
-      <w:r>
-        <w:t>tidle,mix</w:t>
-      </w:r>
-      <w:proofErr w:type="spellEnd"/>
-      <w:proofErr w:type="gramEnd"/>
-      <w:r>
-        <w:t xml:space="preserve">  # see available GPUs</w:t>
-      </w:r>
-    </w:p>
-    <w:p>
-      <w:r>
-        <w:t xml:space="preserve">  </w:t>
-      </w:r>
-      <w:proofErr w:type="spellStart"/>
-      <w:r>
-        <w:t>savail</w:t>
-      </w:r>
-      <w:proofErr w:type="spellEnd"/>
-      <w:r>
-        <w:t xml:space="preserve">                               # custom Mila command for available GPUs</w:t>
+        <w:t xml:space="preserve"> node, and opens your local </w:t>
+      </w:r>
+      <w:proofErr w:type="spellStart"/>
+      <w:r>
+        <w:t>VSCode</w:t>
+      </w:r>
+      <w:proofErr w:type="spellEnd"/>
+      <w:r>
+        <w:t xml:space="preserve"> pointed at the cluster workspace. From there you run finetuning.py directly from the      </w:t>
+      </w:r>
+    </w:p>
+    <w:p>
+      <w:r>
+        <w:t xml:space="preserve">  integrated terminal — no </w:t>
+      </w:r>
+      <w:proofErr w:type="spellStart"/>
+      <w:r>
+        <w:t>rsync</w:t>
+      </w:r>
+      <w:proofErr w:type="spellEnd"/>
+      <w:r>
+        <w:t>, no mismatch.</w:t>
       </w:r>
     </w:p>
     <w:p/>
     <w:p>
       <w:r>
-        <w:t xml:space="preserve">  Tip: If the interactive session drops, re-attach with </w:t>
-      </w:r>
-      <w:proofErr w:type="spellStart"/>
-      <w:r>
-        <w:t>sattach</w:t>
-      </w:r>
-      <w:proofErr w:type="spellEnd"/>
-      <w:r>
-        <w:t xml:space="preserve"> --</w:t>
-      </w:r>
-      <w:proofErr w:type="spellStart"/>
-      <w:r>
-        <w:t>pty</w:t>
-      </w:r>
-      <w:proofErr w:type="spellEnd"/>
-      <w:r>
-        <w:t xml:space="preserve"> &lt;</w:t>
-      </w:r>
-      <w:proofErr w:type="spellStart"/>
-      <w:r>
-        <w:t>jobid</w:t>
-      </w:r>
-      <w:proofErr w:type="spellEnd"/>
-      <w:r>
-        <w:t>&gt;.0</w:t>
+        <w:t xml:space="preserve">  ---</w:t>
+      </w:r>
+    </w:p>
+    <w:p>
+      <w:r>
+        <w:t xml:space="preserve">  When to use which</w:t>
+      </w:r>
+    </w:p>
+    <w:p>
+      <w:r>
+        <w:drawing>
+          <wp:inline distT="0" distB="0" distL="0" distR="0" wp14:anchorId="6CFB99CF" wp14:editId="6ACDD445">
+            <wp:extent cx="5943600" cy="1820545"/>
+            <wp:effectExtent l="0" t="0" r="0" b="8255"/>
+            <wp:docPr id="1989982201" name="Picture 1"/>
+            <wp:cNvGraphicFramePr>
+              <a:graphicFrameLocks xmlns:a="http://schemas.openxmlformats.org/drawingml/2006/main" noChangeAspect="1"/>
+            </wp:cNvGraphicFramePr>
+            <a:graphic xmlns:a="http://schemas.openxmlformats.org/drawingml/2006/main">
+              <a:graphicData uri="http://schemas.openxmlformats.org/drawingml/2006/picture">
+                <pic:pic xmlns:pic="http://schemas.openxmlformats.org/drawingml/2006/picture">
+                  <pic:nvPicPr>
+                    <pic:cNvPr id="1989982201" name=""/>
+                    <pic:cNvPicPr/>
+                  </pic:nvPicPr>
+                  <pic:blipFill>
+                    <a:blip r:embed="rId4"/>
+                    <a:stretch>
+                      <a:fillRect/>
+                    </a:stretch>
+                  </pic:blipFill>
+                  <pic:spPr>
+                    <a:xfrm>
+                      <a:off x="0" y="0"/>
+                      <a:ext cx="5943600" cy="1820545"/>
+                    </a:xfrm>
+                    <a:prstGeom prst="rect">
+                      <a:avLst/>
+                    </a:prstGeom>
+                  </pic:spPr>
+                </pic:pic>
+              </a:graphicData>
+            </a:graphic>
+          </wp:inline>
+        </w:drawing>
+      </w:r>
+    </w:p>
+    <w:p/>
+    <w:p>
+      <w:r>
+        <w:t xml:space="preserve">  For active development on the cluster, </w:t>
+      </w:r>
+      <w:proofErr w:type="spellStart"/>
+      <w:r>
+        <w:t>mila</w:t>
+      </w:r>
+      <w:proofErr w:type="spellEnd"/>
+      <w:r>
+        <w:t xml:space="preserve"> code is the right choice.</w:t>
       </w:r>
     </w:p>
     <w:sectPr>

</xml_diff>